<commit_message>
feat: implement database configuration management, bulk leave processing, and release automation tools
</commit_message>
<xml_diff>
--- a/docs/HR_Leave_Management_User_Manual.docx
+++ b/docs/HR_Leave_Management_User_Manual.docx
@@ -112,6 +112,46 @@
               <w:rPr>
                 <w:b/>
               </w:rPr>
+              <w:t>Release</w:t>
+            </w:r>
+          </w:p>
+        </w:tc>
+        <w:tc>
+          <w:tcPr>
+            <w:tcW w:type="dxa" w:w="7160"/>
+            <w:tcMar>
+              <w:top w:w="80" w:type="dxa"/>
+              <w:bottom w:w="80" w:type="dxa"/>
+              <w:start w:w="120" w:type="dxa"/>
+              <w:end w:w="120" w:type="dxa"/>
+            </w:tcMar>
+            <w:vAlign w:val="center"/>
+          </w:tcPr>
+          <w:p>
+            <w:r>
+              <w:t>Version 1.0.5 (build 12)</w:t>
+            </w:r>
+          </w:p>
+        </w:tc>
+      </w:tr>
+      <w:tr>
+        <w:tc>
+          <w:tcPr>
+            <w:tcW w:type="dxa" w:w="2200"/>
+            <w:tcMar>
+              <w:top w:w="80" w:type="dxa"/>
+              <w:bottom w:w="80" w:type="dxa"/>
+              <w:start w:w="120" w:type="dxa"/>
+              <w:end w:w="120" w:type="dxa"/>
+            </w:tcMar>
+            <w:vAlign w:val="center"/>
+            <w:shd w:fill="E8EEF5"/>
+          </w:tcPr>
+          <w:p>
+            <w:r>
+              <w:rPr>
+                <w:b/>
+              </w:rPr>
               <w:t>Primary users</w:t>
             </w:r>
           </w:p>
@@ -196,7 +236,7 @@
           <w:color w:val="1F2937"/>
           <w:sz w:val="22"/>
         </w:rPr>
-        <w:t>HR Leave Management is a Windows desktop application for managing carry-forward leave, leave taken entries, report target configuration, and user access. It connects directly to SQL Server using the settings in config.ini.</w:t>
+        <w:t>HR Leave Management is a Windows desktop application for managing carry-forward leave, credit leave, leave taken entries, report target configuration, and user access. It connects directly to SQL Server using the settings in config.ini.</w:t>
       </w:r>
     </w:p>
     <w:tbl>
@@ -282,6 +322,9 @@
         <w:gridCol w:w="4080"/>
       </w:tblGrid>
       <w:tr>
+        <w:trPr>
+          <w:tblHeader w:val="true"/>
+        </w:trPr>
         <w:tc>
           <w:tcPr>
             <w:tcW w:type="dxa" w:w="1800"/>
@@ -389,7 +432,7 @@
                 <w:color w:val="1F2937"/>
                 <w:sz w:val="22"/>
               </w:rPr>
-              <w:t>Bring Forward, Leave Taken, DB Targets, Leave Report Config, Manage Users</w:t>
+              <w:t>Bring Forward, Leave Taken, DB Targets. Report Config and Manage Users require Admin=1.</w:t>
             </w:r>
           </w:p>
         </w:tc>
@@ -442,7 +485,7 @@
                 <w:color w:val="1F2937"/>
                 <w:sz w:val="22"/>
               </w:rPr>
-              <w:t>Bring Forward, Leave Taken</w:t>
+              <w:t>Bring Forward, Leave Taken. Report Config and Manage Users require Admin=1.</w:t>
             </w:r>
           </w:p>
         </w:tc>
@@ -495,7 +538,7 @@
                 <w:color w:val="1F2937"/>
                 <w:sz w:val="22"/>
               </w:rPr>
-              <w:t>Leave Report Config</w:t>
+              <w:t>Leave Report Config only when Admin=1.</w:t>
             </w:r>
           </w:p>
         </w:tc>
@@ -512,7 +555,59 @@
                 <w:color w:val="1F2937"/>
                 <w:sz w:val="22"/>
               </w:rPr>
-              <w:t>Maintain daily report targets only.</w:t>
+              <w:t>Maintain daily report targets when enabled.</w:t>
+            </w:r>
+          </w:p>
+        </w:tc>
+      </w:tr>
+    </w:tbl>
+    <w:p/>
+    <w:tbl>
+      <w:tblPr>
+        <w:tblStyle w:val="TableGrid"/>
+        <w:tblW w:type="dxa" w:w="9360"/>
+        <w:jc w:val="left"/>
+        <w:tblLayout w:type="fixed"/>
+        <w:tblLook w:firstColumn="1" w:firstRow="1" w:lastColumn="0" w:lastRow="0" w:noHBand="0" w:noVBand="1" w:val="04A0"/>
+        <w:tblInd w:w="120" w:type="dxa"/>
+        <w:tblBorders>
+          <w:top w:val="single" w:sz="4" w:space="0" w:color="D8DEE8"/>
+          <w:left w:val="single" w:sz="4" w:space="0" w:color="D8DEE8"/>
+          <w:bottom w:val="single" w:sz="4" w:space="0" w:color="D8DEE8"/>
+          <w:right w:val="single" w:sz="4" w:space="0" w:color="D8DEE8"/>
+          <w:insideH w:val="single" w:sz="4" w:space="0" w:color="D8DEE8"/>
+          <w:insideV w:val="single" w:sz="4" w:space="0" w:color="D8DEE8"/>
+        </w:tblBorders>
+      </w:tblPr>
+      <w:tblGrid>
+        <w:gridCol w:w="9360"/>
+      </w:tblGrid>
+      <w:tr>
+        <w:tc>
+          <w:tcPr>
+            <w:tcW w:type="dxa" w:w="9360"/>
+            <w:tcMar>
+              <w:top w:w="80" w:type="dxa"/>
+              <w:bottom w:w="80" w:type="dxa"/>
+              <w:start w:w="120" w:type="dxa"/>
+              <w:end w:w="120" w:type="dxa"/>
+            </w:tcMar>
+            <w:vAlign w:val="center"/>
+            <w:shd w:fill="F4F6F9"/>
+          </w:tcPr>
+          <w:p>
+            <w:pPr>
+              <w:spacing w:after="0"/>
+            </w:pPr>
+            <w:r>
+              <w:rPr>
+                <w:rFonts w:ascii="Calibri" w:hAnsi="Calibri"/>
+                <w:b w:val="0"/>
+                <w:i w:val="0"/>
+                <w:color w:val="1F4D78"/>
+                <w:sz w:val="22"/>
+              </w:rPr>
+              <w:t>Admin=1 under DatabaseConfig is required to show Leave Report Config and Manage Users in the sidebar, including for an ADMIN login. DB Targets remains controlled by the ADMIN role. Database authorization checks still apply to Manage Users operations.</w:t>
             </w:r>
           </w:p>
         </w:tc>
@@ -612,7 +707,7 @@
         <w:pStyle w:val="Heading1"/>
       </w:pPr>
       <w:r>
-        <w:t>4. Bring Forward Leave</w:t>
+        <w:t>4. Bring Forward and Credit Leave</w:t>
       </w:r>
     </w:p>
     <w:p>
@@ -627,7 +722,7 @@
           <w:color w:val="1F2937"/>
           <w:sz w:val="22"/>
         </w:rPr>
-        <w:t>Use Bring Forward to add carry-forward annual leave records.</w:t>
+        <w:t>Use Bring Forward to add carry-forward and credit annual leave records. BF values are stored as BF(AL), while credit values are stored as CR(AL).</w:t>
       </w:r>
     </w:p>
     <w:p>
@@ -659,7 +754,7 @@
           <w:color w:val="1F2937"/>
           <w:sz w:val="22"/>
         </w:rPr>
-        <w:t>Select Target Year and Target Month.</w:t>
+        <w:t>Select the Target Year.</w:t>
       </w:r>
     </w:p>
     <w:p>
@@ -675,7 +770,7 @@
           <w:color w:val="1F2937"/>
           <w:sz w:val="22"/>
         </w:rPr>
-        <w:t>Enter Employee Code and Days Leave manually, or use Import Excel.</w:t>
+        <w:t>Enter Employee Code and at least one of BF Days or CR Days manually, or use Import Excel.</w:t>
       </w:r>
     </w:p>
     <w:p>
@@ -724,6 +819,38 @@
           <w:sz w:val="22"/>
         </w:rPr>
         <w:t>Export Excel creates a template for bulk entry.</w:t>
+      </w:r>
+    </w:p>
+    <w:p>
+      <w:pPr>
+        <w:pStyle w:val="ListBullet"/>
+        <w:spacing w:after="80"/>
+      </w:pPr>
+      <w:r>
+        <w:rPr>
+          <w:rFonts w:ascii="Calibri" w:hAnsi="Calibri"/>
+          <w:b w:val="0"/>
+          <w:i w:val="0"/>
+          <w:color w:val="1F2937"/>
+          <w:sz w:val="22"/>
+        </w:rPr>
+        <w:t>The BF Excel sheet uses column C for Bring Forward Days and column D for Credit Leave Days.</w:t>
+      </w:r>
+    </w:p>
+    <w:p>
+      <w:pPr>
+        <w:pStyle w:val="ListBullet"/>
+        <w:spacing w:after="80"/>
+      </w:pPr>
+      <w:r>
+        <w:rPr>
+          <w:rFonts w:ascii="Calibri" w:hAnsi="Calibri"/>
+          <w:b w:val="0"/>
+          <w:i w:val="0"/>
+          <w:color w:val="1F2937"/>
+          <w:sz w:val="22"/>
+        </w:rPr>
+        <w:t>Leaving BF or CR blank preserves that existing value when replacing the other value.</w:t>
       </w:r>
     </w:p>
     <w:p>
@@ -826,7 +953,7 @@
           <w:color w:val="1F2937"/>
           <w:sz w:val="22"/>
         </w:rPr>
-        <w:t>Choose the Leave Type loaded from dbo.LV_TYPE.</w:t>
+        <w:t>Choose the Leave Type loaded from dbo.LV_TYPE. PH, OFF, RL, and REST are also available.</w:t>
       </w:r>
     </w:p>
     <w:p>
@@ -861,6 +988,58 @@
         <w:t>Click Run Leave Taken to write valid rows to SQL Server.</w:t>
       </w:r>
     </w:p>
+    <w:tbl>
+      <w:tblPr>
+        <w:tblStyle w:val="TableGrid"/>
+        <w:tblW w:type="dxa" w:w="9360"/>
+        <w:jc w:val="left"/>
+        <w:tblLayout w:type="fixed"/>
+        <w:tblLook w:firstColumn="1" w:firstRow="1" w:lastColumn="0" w:lastRow="0" w:noHBand="0" w:noVBand="1" w:val="04A0"/>
+        <w:tblInd w:w="120" w:type="dxa"/>
+        <w:tblBorders>
+          <w:top w:val="single" w:sz="4" w:space="0" w:color="D8DEE8"/>
+          <w:left w:val="single" w:sz="4" w:space="0" w:color="D8DEE8"/>
+          <w:bottom w:val="single" w:sz="4" w:space="0" w:color="D8DEE8"/>
+          <w:right w:val="single" w:sz="4" w:space="0" w:color="D8DEE8"/>
+          <w:insideH w:val="single" w:sz="4" w:space="0" w:color="D8DEE8"/>
+          <w:insideV w:val="single" w:sz="4" w:space="0" w:color="D8DEE8"/>
+        </w:tblBorders>
+      </w:tblPr>
+      <w:tblGrid>
+        <w:gridCol w:w="9360"/>
+      </w:tblGrid>
+      <w:tr>
+        <w:tc>
+          <w:tcPr>
+            <w:tcW w:type="dxa" w:w="9360"/>
+            <w:tcMar>
+              <w:top w:w="80" w:type="dxa"/>
+              <w:bottom w:w="80" w:type="dxa"/>
+              <w:start w:w="120" w:type="dxa"/>
+              <w:end w:w="120" w:type="dxa"/>
+            </w:tcMar>
+            <w:vAlign w:val="center"/>
+            <w:shd w:fill="F4F6F9"/>
+          </w:tcPr>
+          <w:p>
+            <w:pPr>
+              <w:spacing w:after="0"/>
+            </w:pPr>
+            <w:r>
+              <w:rPr>
+                <w:rFonts w:ascii="Calibri" w:hAnsi="Calibri"/>
+                <w:b w:val="0"/>
+                <w:i w:val="0"/>
+                <w:color w:val="1F4D78"/>
+                <w:sz w:val="22"/>
+              </w:rPr>
+              <w:t>If the same employee, calendar date, and leave code already exists in LV_RECORDS, that row is skipped and written to Leave_Import_Failed_&lt;timestamp&gt;.xlsx under the log folder. Other valid rows continue processing.</w:t>
+            </w:r>
+          </w:p>
+        </w:tc>
+      </w:tr>
+    </w:tbl>
+    <w:p/>
     <w:p>
       <w:pPr>
         <w:pStyle w:val="Heading1"/>
@@ -904,7 +1083,7 @@
           <w:color w:val="1F2937"/>
           <w:sz w:val="22"/>
         </w:rPr>
-        <w:t>Leave Report Config is available to ADMIN and REPORT users. It connects to the fixed database HR_REPORT_CONFIG using the ReportConfig section in config.ini.</w:t>
+        <w:t>Leave Report Config is shown only when DatabaseConfig Admin=1. It connects to the fixed database HR_REPORT_CONFIG on v1soho.com,1500 by default. To use another report server, add a ReportConfig section with a Server value in config.ini. The report driver follows DatabaseConfig Driver.</w:t>
       </w:r>
     </w:p>
     <w:p>
@@ -1059,7 +1238,7 @@
           <w:color w:val="1F2937"/>
           <w:sz w:val="22"/>
         </w:rPr>
-        <w:t>Manage Users is available to ADMIN users only.</w:t>
+        <w:t>Manage Users is shown only when DatabaseConfig Admin=1. User-management actions still require database ADMIN authorization.</w:t>
       </w:r>
     </w:p>
     <w:p>
@@ -1157,6 +1336,9 @@
         <w:gridCol w:w="4760"/>
       </w:tblGrid>
       <w:tr>
+        <w:trPr>
+          <w:tblHeader w:val="true"/>
+        </w:trPr>
         <w:tc>
           <w:tcPr>
             <w:tcW w:type="dxa" w:w="2100"/>
@@ -1406,7 +1588,7 @@
                 <w:color w:val="1F2937"/>
                 <w:sz w:val="22"/>
               </w:rPr>
-              <w:t>ReportConfig</w:t>
+              <w:t>DatabaseConfig</w:t>
             </w:r>
           </w:p>
         </w:tc>
@@ -1423,7 +1605,7 @@
                 <w:color w:val="1F2937"/>
                 <w:sz w:val="22"/>
               </w:rPr>
-              <w:t>Server</w:t>
+              <w:t>Admin</w:t>
             </w:r>
           </w:p>
         </w:tc>
@@ -1440,7 +1622,7 @@
                 <w:color w:val="1F2937"/>
                 <w:sz w:val="22"/>
               </w:rPr>
-              <w:t>SQL Server for HR_REPORT_CONFIG.</w:t>
+              <w:t>Set to 1 to show Leave Report Config and Manage Users in the sidebar.</w:t>
             </w:r>
           </w:p>
         </w:tc>
@@ -1476,7 +1658,7 @@
                 <w:color w:val="1F2937"/>
                 <w:sz w:val="22"/>
               </w:rPr>
-              <w:t>Driver</w:t>
+              <w:t>Server</w:t>
             </w:r>
           </w:p>
         </w:tc>
@@ -1493,7 +1675,7 @@
                 <w:color w:val="1F2937"/>
                 <w:sz w:val="22"/>
               </w:rPr>
-              <w:t>ODBC driver for HR_REPORT_CONFIG.</w:t>
+              <w:t>Optional override for HR_REPORT_CONFIG. Defaults to v1soho.com,1500.</w:t>
             </w:r>
           </w:p>
         </w:tc>
@@ -1553,7 +1735,7 @@
           <w:color w:val="1F2937"/>
           <w:sz w:val="22"/>
         </w:rPr>
-        <w:t>Leave types do not load: verify dbo.LV_TYPE exists and contains rows where LV_EVENT_CODE equals LEAVE.</w:t>
+        <w:t>Leave types do not load: verify dbo.LV_TYPE exists and contains the required LEAVE types or operational PH, OFF, RL, and REST codes.</w:t>
       </w:r>
     </w:p>
     <w:p>

</xml_diff>